<commit_message>
Supabase DB 대시보드(docs/index.html, GitHub Pages) 추가, 보고서 각주·README에 링크
</commit_message>
<xml_diff>
--- a/output/g4h29mJufpc_20260919T063349180506Z/청약인식_보고서초안_B안.docx
+++ b/output/g4h29mJufpc_20260919T063349180506Z/청약인식_보고서초안_B안.docx
@@ -12351,7 +12351,7 @@
       <w:r>
         <w:t xml:space="preserve">크랩, 「청약통장 다들 왜 깨고 있을까?」, YouTube, 2026. </w:t>
       </w:r>
-      <w:hyperlink w:history="1" r:id="rIdjpxizbb9cxba_nyanhi4e">
+      <w:hyperlink w:history="1" r:id="rIdc4rzphvw7yt34jerauu3h">
         <w:r>
           <w:rPr>
             <w:rStyle w:val="Hyperlink"/>
@@ -12374,7 +12374,7 @@
       <w:r>
         <w:t xml:space="preserve">뉴스핌, 「“청약 넣어도 부담”…청약통장 4년째 가입보다 해지 많아」, 2026.8.31. </w:t>
       </w:r>
-      <w:hyperlink w:history="1" r:id="rIdohbm6gbhucqczp_3uamud">
+      <w:hyperlink w:history="1" r:id="rIdx75k7wevnqbldwgss5itj">
         <w:r>
           <w:rPr>
             <w:rStyle w:val="Hyperlink"/>
@@ -12397,7 +12397,7 @@
       <w:r>
         <w:t xml:space="preserve">한국경제, 「어차피 당첨 안돼 줄줄이 청약통장 찢었다…역대급 상황」, 2026.9.13. </w:t>
       </w:r>
-      <w:hyperlink w:history="1" r:id="rIdqduphc2t1vdmqhtsojaae">
+      <w:hyperlink w:history="1" r:id="rId0wsddag-atxhnkzhr1bgp">
         <w:r>
           <w:rPr>
             <w:rStyle w:val="Hyperlink"/>
@@ -12420,7 +12420,7 @@
       <w:r>
         <w:t xml:space="preserve">뉴데일리, 「서울 아파트 평당 분양가 6287만원, 1년 새 34% 급등」, 2026.9.18. </w:t>
       </w:r>
-      <w:hyperlink w:history="1" r:id="rIdlaoglta32k8and7qzfpiz">
+      <w:hyperlink w:history="1" r:id="rIdsufefmo--o8cwhjqqul7i">
         <w:r>
           <w:rPr>
             <w:rStyle w:val="Hyperlink"/>
@@ -12443,7 +12443,7 @@
       <w:r>
         <w:t xml:space="preserve">대한민국 정책브리핑, 「서울·경기 12곳 주담대 한도 축소…25억 초과 주택 2억 원까지만」, 2025.10.15. </w:t>
       </w:r>
-      <w:hyperlink w:history="1" r:id="rIdk1sxeuhu2hemmkpyyqvfj">
+      <w:hyperlink w:history="1" r:id="rIdjrxj8ie7dazg_ywuiaone">
         <w:r>
           <w:rPr>
             <w:rStyle w:val="Hyperlink"/>
@@ -12466,7 +12466,7 @@
       <w:r>
         <w:t xml:space="preserve">글로벌이코노믹, 「서울 아파트 매매·전세 상승률 격차 0.17%P…나란히 7%대 상승」, 2026.9.15. </w:t>
       </w:r>
-      <w:hyperlink w:history="1" r:id="rIdidateaockkyz5ckhxzfgf">
+      <w:hyperlink w:history="1" r:id="rIdzv1lkmgkw7_mnspy656nw">
         <w:r>
           <w:rPr>
             <w:rStyle w:val="Hyperlink"/>
@@ -12489,7 +12489,7 @@
       <w:r>
         <w:t xml:space="preserve">국제뉴스, 「한국부동산원, 9월 첫째 주 전국 아파트값 0.08%↑…서울 0.20% 상승」, 2026.9.10. </w:t>
       </w:r>
-      <w:hyperlink w:history="1" r:id="rIdinls8ys4e9vjgoogksx-r">
+      <w:hyperlink w:history="1" r:id="rIdage0fgqsqbbrr6rewdvad">
         <w:r>
           <w:rPr>
             <w:rStyle w:val="Hyperlink"/>
@@ -12512,7 +12512,7 @@
       <w:r>
         <w:t xml:space="preserve">공공데이터포털, 한국부동산원 청약홈 청약통장 전체 가입현황 (15088657) </w:t>
       </w:r>
-      <w:hyperlink w:history="1" r:id="rIdibjr9t6efyhv95xgntl-_">
+      <w:hyperlink w:history="1" r:id="rIdahshuh6gdnsshho8jhurn">
         <w:r>
           <w:rPr>
             <w:rStyle w:val="Hyperlink"/>
@@ -12535,7 +12535,7 @@
       <w:r>
         <w:t xml:space="preserve">공공데이터포털, 한국부동산원 청약홈 청약통장 통계 조회 서비스 (15114369) </w:t>
       </w:r>
-      <w:hyperlink w:history="1" r:id="rIde6d5nrsrjvuajk2cvs7tq">
+      <w:hyperlink w:history="1" r:id="rIdfh6tgkzogfezu-moee4rs">
         <w:r>
           <w:rPr>
             <w:rStyle w:val="Hyperlink"/>
@@ -12558,7 +12558,7 @@
       <w:r>
         <w:t xml:space="preserve">공공데이터포털, 한국부동산원 지역별 청약 신청자·당첨자 정보 (15110975, 15110976) </w:t>
       </w:r>
-      <w:hyperlink w:history="1" r:id="rIdscv5bgl-iasjmwvhb_miq">
+      <w:hyperlink w:history="1" r:id="rIdbrwwnhyjbwoulqkr4dbuh">
         <w:r>
           <w:rPr>
             <w:rStyle w:val="Hyperlink"/>
@@ -12581,7 +12581,7 @@
       <w:r>
         <w:t xml:space="preserve">공공데이터포털, 한국부동산원 중위매매가격·중위단위매매가격 (15112206, 15112207) </w:t>
       </w:r>
-      <w:hyperlink w:history="1" r:id="rIdl8msi3xarwy9scu7-kcv3">
+      <w:hyperlink w:history="1" r:id="rId9ywfsu-vhmzrlrekp9yn3">
         <w:r>
           <w:rPr>
             <w:rStyle w:val="Hyperlink"/>
@@ -12604,7 +12604,7 @@
       <w:r>
         <w:t xml:space="preserve">공공데이터포털, 국토교통부 아파트 매매 실거래가 상세 자료 (15126468) </w:t>
       </w:r>
-      <w:hyperlink w:history="1" r:id="rIdp-bp6-teojiw4dphm9pez">
+      <w:hyperlink w:history="1" r:id="rIdoat8ryilotmx6tmfvz8--">
         <w:r>
           <w:rPr>
             <w:rStyle w:val="Hyperlink"/>
@@ -12627,7 +12627,7 @@
       <w:r>
         <w:t xml:space="preserve">YouTube Data API v3, CommentThreads: list </w:t>
       </w:r>
-      <w:hyperlink w:history="1" r:id="rIdr1uotrxft80mnen31srt5">
+      <w:hyperlink w:history="1" r:id="rIdxi-vnhley_fvcyhu_8krp">
         <w:r>
           <w:rPr>
             <w:rStyle w:val="Hyperlink"/>
@@ -12650,7 +12650,7 @@
       <w:r>
         <w:t xml:space="preserve">OpenRouter, openai/gpt-oss-120b (댓글 분류 모델) </w:t>
       </w:r>
-      <w:hyperlink w:history="1" r:id="rId1rj9drcycpdq6izr6udgl">
+      <w:hyperlink w:history="1" r:id="rIdmjdoh6wjd0csfxdhjqfq5">
         <w:r>
           <w:rPr>
             <w:rStyle w:val="Hyperlink"/>
@@ -13132,7 +13132,7 @@
         </w:rPr>
         <w:t xml:space="preserve">코드 저장소(GitHub): </w:t>
       </w:r>
-      <w:hyperlink w:history="1" r:id="rIdv43kjzr4w93gicfpy-lu7">
+      <w:hyperlink w:history="1" r:id="rIdwumxaoaqmeyyvtzpgqwsw">
         <w:r>
           <w:rPr>
             <w:rStyle w:val="Hyperlink"/>
@@ -13166,9 +13166,28 @@
           <w:sz w:val="17"/>
           <w:szCs w:val="17"/>
         </w:rPr>
-        <w:t xml:space="preserve">Supabase 조회 링크(읽기 전용, 로그인 불필요) — 댓글 분류 결과(처음 100행): </w:t>
-      </w:r>
-      <w:hyperlink w:history="1" r:id="rIdxyi3bqzlrklqwtca_jqbq">
+        <w:t xml:space="preserve">Supabase DB 대시보드(로그인 불필요): </w:t>
+      </w:r>
+      <w:hyperlink w:history="1" r:id="rIdy9yrwibl-ohxsp-1pybx1">
+        <w:r>
+          <w:rPr>
+            <w:rStyle w:val="Hyperlink"/>
+            <w:color w:val="2A78D6"/>
+            <w:sz w:val="17"/>
+            <w:szCs w:val="17"/>
+            <w:u w:val="single"/>
+          </w:rPr>
+          <w:t xml:space="preserve">https://ghlee1016.github.io/Chungyak_analyze/</w:t>
+        </w:r>
+      </w:hyperlink>
+      <w:r>
+        <w:rPr>
+          <w:sz w:val="17"/>
+          <w:szCs w:val="17"/>
+        </w:rPr>
+        <w:t xml:space="preserve"> / 원본 JSON — 댓글 분류 결과(처음 100행): </w:t>
+      </w:r>
+      <w:hyperlink w:history="1" r:id="rIdhefa3dgh08uki-9956mtg">
         <w:r>
           <w:rPr>
             <w:rStyle w:val="Hyperlink"/>
@@ -13187,7 +13206,7 @@
         </w:rPr>
         <w:t xml:space="preserve"> / 실행 정보: </w:t>
       </w:r>
-      <w:hyperlink w:history="1" r:id="rIdzjtaxjowrw4zbrpitctzh">
+      <w:hyperlink w:history="1" r:id="rIdi5gxl__iekr3ump_kk7u2">
         <w:r>
           <w:rPr>
             <w:rStyle w:val="Hyperlink"/>

</xml_diff>